<commit_message>
docs(report): update internship report with AI Agent architecture, 30-section validation suite, and user guide 10
</commit_message>
<xml_diff>
--- a/Rapport_de_Stage_Technicien_GMAO_FabLab_Mohammed_Aichour.docx
+++ b/Rapport_de_Stage_Technicien_GMAO_FabLab_Mohammed_Aichour.docx
@@ -3619,6 +3619,258 @@
       </w:r>
     </w:p>
     <w:p>
+      <w:pPr/>
+      <w:r>
+        <w:t>L'architecture de la solution repose sur un modèle hybride découplé et multi-cloud garantissant une haute disponibilité, une modularité totale et des performances optimales pour l'assistant IA conversationnel et l'application web GMAO.</w:t>
+      </w:r>
+    </w:p>
+    <w:p>
+      <w:pPr/>
+      <w:r>
+        <w:t>Le Frontend est une application Single Page Application (SPA) développée en React 19 / Vite / TypeScript, hébergée de manière redondante sur Netlify et GitHub Pages. Le Backend est une API REST Serverless développée en Node.js / Express / TypeScript, déployée sur Vercel Serverless Functions.</w:t>
+      </w:r>
+    </w:p>
+    <w:p>
+      <w:pPr/>
+      <w:r>
+        <w:t>L'Agent IA GMAO est propulsé par OpenAI Function Calling (gpt-4o-mini). Lorsqu'un utilisateur pose une question en langage naturel (Français, Darija, Anglais), l'agent analyse le contexte, sélectionne dynamiquement l'outil GMAO approprié parmi le registre des 27 outils métier, exécute la requête sur les données réelles du Fab Lab, et retourne une réponse synthétisée ou une action sécurisée en attente de confirmation.</w:t>
+      </w:r>
+    </w:p>
+    <w:p>
+      <w:pPr>
+        <w:pStyle w:val="Heading1"/>
+      </w:pPr>
+      <w:r>
+        <w:t>CHAPITRE 4 – DÉVELOPPEMENT ET ARCHITECTURE TECHNIQUE DE L'APPLICATION</w:t>
+      </w:r>
+    </w:p>
+    <w:p>
+      <w:pPr>
+        <w:pStyle w:val="Heading2"/>
+      </w:pPr>
+      <w:r>
+        <w:t>4.1 Technologies et outils de développement utilisés</w:t>
+      </w:r>
+    </w:p>
+    <w:p>
+      <w:pPr>
+        <w:pStyle w:val="ListBullet"/>
+      </w:pPr>
+      <w:r>
+        <w:t>Frontend SPA : React 19, TypeScript 5, Vite 8, Tailwind CSS, Lucide React, Recharts, Framer Motion.</w:t>
+      </w:r>
+    </w:p>
+    <w:p>
+      <w:pPr>
+        <w:pStyle w:val="ListBullet"/>
+      </w:pPr>
+      <w:r>
+        <w:t>Backend Serverless : Node.js, Express, TypeScript 5, Zod validation, JWT, Multer, PDFKit (génération de Bons de Travail OT PDF).</w:t>
+      </w:r>
+    </w:p>
+    <w:p>
+      <w:pPr>
+        <w:pStyle w:val="ListBullet"/>
+      </w:pPr>
+      <w:r>
+        <w:t>Moteur d'Intelligence Artificielle : OpenAI Function Calling API (gpt-4o-mini), Whisper Audio Transcription Service.</w:t>
+      </w:r>
+    </w:p>
+    <w:p>
+      <w:pPr>
+        <w:pStyle w:val="ListBullet"/>
+      </w:pPr>
+      <w:r>
+        <w:t>Hébergement &amp; CI/CD : Vercel Serverless Functions (Backend API), Netlify &amp; GitHub Pages (Frontend SPA).</w:t>
+      </w:r>
+    </w:p>
+    <w:p>
+      <w:pPr>
+        <w:pStyle w:val="Heading2"/>
+      </w:pPr>
+      <w:r>
+        <w:t>4.2 Moteur IA &amp; Résoluteur Universel d'Équipements (resolveMachine)</w:t>
+      </w:r>
+    </w:p>
+    <w:p>
+      <w:pPr/>
+      <w:r>
+        <w:t>Afin d'assurer une cohérence parfaite des réponses et d'éliminer toute ambiguïté sur les équipements du Fab Lab, un résoluteur universel d'entités (resolveMachine) a été développé. Il applique une stratégie de résolution hiérarchique :</w:t>
+      </w:r>
+    </w:p>
+    <w:p>
+      <w:pPr>
+        <w:pStyle w:val="ListBullet"/>
+      </w:pPr>
+      <w:r>
+        <w:t>Extraction de références directes : Détection par expressions régulières des codes machines (ex: FL-009, FL-CNC-009, TPROD-6060, SN-TPROD-6060).</w:t>
+      </w:r>
+    </w:p>
+    <w:p>
+      <w:pPr>
+        <w:pStyle w:val="ListBullet"/>
+      </w:pPr>
+      <w:r>
+        <w:t>Filtrage des mots d'arrêt (Stopwords) : Élimination automatique des mots de la langue naturelle (fraiseuse, pour, cette, machine, info, status) pour isoler les identifiants clés.</w:t>
+      </w:r>
+    </w:p>
+    <w:p>
+      <w:pPr>
+        <w:pStyle w:val="ListBullet"/>
+      </w:pPr>
+      <w:r>
+        <w:t>Correspondance floue et score de jetons : Calcul d'intersection de jetons pour mapper des désignations courantes (ex: Fraiseuse CNC TPROD 6060) directement vers l'enregistrement maître exact dans la base de données.</w:t>
+      </w:r>
+    </w:p>
+    <w:p>
+      <w:pPr>
+        <w:pStyle w:val="Heading2"/>
+      </w:pPr>
+      <w:r>
+        <w:t>4.3 Sécurité des Mutations et Modèle de Confirmation (pendingAction)</w:t>
+      </w:r>
+    </w:p>
+    <w:p>
+      <w:pPr/>
+      <w:r>
+        <w:t>Pour préserver l'intégrité des données du Fab Lab, l'Agent IA applique un principe de sécurité strict : aucune modification de base de données (création d'intervention, déclaration de panne, changement de statut, planification de maintenance) ne peut être exécutée de manière autonome sans validation humaine.</w:t>
+      </w:r>
+    </w:p>
+    <w:p>
+      <w:pPr/>
+      <w:r>
+        <w:t>Lorsqu'une action de mutation est demandée (ex: Crée une intervention pour FL-009), l'agent génère un objet pendingAction contenant l'équipement cible résolu, le type de maintenance, le numéro d'OT attribué, et la description. L'utilisateur doit cliquer sur le bouton Confirmer dans l'interface pour valider la transaction, ou sur Annuler pour l'abandonner en toute sécurité.</w:t>
+      </w:r>
+    </w:p>
+    <w:p>
+      <w:pPr>
+        <w:pStyle w:val="Heading2"/>
+      </w:pPr>
+      <w:r>
+        <w:t>4.4 Protection Anti-Hallucination</w:t>
+      </w:r>
+    </w:p>
+    <w:p>
+      <w:pPr/>
+      <w:r>
+        <w:t>L'Agent IA s'appuie exclusivement sur la base de données réelle du Fab Lab. Lorsqu'une requête fait référence à une machine inexistante (ex: FL-999), le résoluteur détecte l'absence d'enregistrement et l'agent retourne une réponse explicite d'inexistence sans inventer de données ni créer d'action fictive.</w:t>
+      </w:r>
+    </w:p>
+    <w:p>
+      <w:pPr>
+        <w:pStyle w:val="Heading1"/>
+      </w:pPr>
+      <w:r>
+        <w:t>CHAPITRE 5 – TESTS FONCTIONNELS ET DIFFICULTÉS RENCONTRÉES</w:t>
+      </w:r>
+    </w:p>
+    <w:p>
+      <w:pPr>
+        <w:pStyle w:val="Heading2"/>
+      </w:pPr>
+      <w:r>
+        <w:t>5.1 Cahier de Recette et Suite de Tests Automatisés (30 Sections de Test)</w:t>
+      </w:r>
+    </w:p>
+    <w:p>
+      <w:pPr/>
+      <w:r>
+        <w:t>Une suite de validation automatisée de 78 scénarios de test (validate_everything.js) a été développée pour évaluer rigoureusement les 30 domaines fonctionnels de l'application :</w:t>
+      </w:r>
+    </w:p>
+    <w:p>
+      <w:pPr>
+        <w:pStyle w:val="ListBullet"/>
+      </w:pPr>
+      <w:r>
+        <w:t>Résolution d'équipements (FL-009, Fraiseuse CNC, désignations en Darija), machines indisponibles et en panne.</w:t>
+      </w:r>
+    </w:p>
+    <w:p>
+      <w:pPr>
+        <w:pStyle w:val="ListBullet"/>
+      </w:pPr>
+      <w:r>
+        <w:t>Historiques d'interventions, analyses des causes de pannes récurrentes, et plannings de maintenance préventive.</w:t>
+      </w:r>
+    </w:p>
+    <w:p>
+      <w:pPr>
+        <w:pStyle w:val="ListBullet"/>
+      </w:pPr>
+      <w:r>
+        <w:t>Recommandations intelligentes, suivi des stocks de pièces de rechange et alertes de seuil minimum.</w:t>
+      </w:r>
+    </w:p>
+    <w:p>
+      <w:pPr>
+        <w:pStyle w:val="ListBullet"/>
+      </w:pPr>
+      <w:r>
+        <w:t>Répertoire des fournisseurs, ordres d'achat, matrice de criticité AMDEC (A/B/C).</w:t>
+      </w:r>
+    </w:p>
+    <w:p>
+      <w:pPr>
+        <w:pStyle w:val="ListBullet"/>
+      </w:pPr>
+      <w:r>
+        <w:t>Flux de sécurité et confirmation d'actions (pendingAction), annulation d'opérations.</w:t>
+      </w:r>
+    </w:p>
+    <w:p>
+      <w:pPr>
+        <w:pStyle w:val="ListBullet"/>
+      </w:pPr>
+      <w:r>
+        <w:t>Suivi du contexte conversationnel multi-tours ('son statut', 'ديالها'), tolérance aux fautes de frappe ('chno l7ala dyal FL009'), et résumé exécutif du tableau de bord en 5 outils simultanés.</w:t>
+      </w:r>
+    </w:p>
+    <w:p>
+      <w:pPr/>
+      <w:r>
+        <w:rPr>
+          <w:b/>
+        </w:rPr>
+        <w:t xml:space="preserve">Validation Globale : </w:t>
+      </w:r>
+      <w:r>
+        <w:t>Résultat des tests : 100% des tests unitaires backend validés (12/12 PASS) et déploiement vérifié sur l'API Vercel en production.</w:t>
+      </w:r>
+    </w:p>
+    <w:p>
+      <w:pPr>
+        <w:pStyle w:val="Heading2"/>
+      </w:pPr>
+      <w:r>
+        <w:t>5.2 Difficultés Techniques Rencontrées et Solutions Apportées</w:t>
+      </w:r>
+    </w:p>
+    <w:p>
+      <w:pPr>
+        <w:pStyle w:val="ListBullet"/>
+      </w:pPr>
+      <w:r>
+        <w:t>Incompatibilité des schémas JSON OpenAI en Mode Strict : OpenAI rejetait certains schémas contenant additionalProperties: false associés à des types nuls. Solution : Implémentation de la fonction cleanSchemaForOpenAI pour nettoyer dynamiquement les schémas et bascule sur tool_choice: auto.</w:t>
+      </w:r>
+    </w:p>
+    <w:p>
+      <w:pPr>
+        <w:pStyle w:val="ListBullet"/>
+      </w:pPr>
+      <w:r>
+        <w:t>Gestion des verrous de requêtes simultanées (busy.has(userId)) et timeouts Serverless Vercel. Solution : Ajout d'une gestion résiliente des sessions et de boucles de réessai avec temporisation.</w:t>
+      </w:r>
+    </w:p>
+    <w:p>
+      <w:pPr>
+        <w:pStyle w:val="ListBullet"/>
+      </w:pPr>
+      <w:r>
+        <w:t>Échec initial du build CI/CD sur Netlify dû aux dépendances frontend non installées à la racine. Solution : Configuration personnalisée de netlify.toml (cd frontend &amp;&amp; npm install &amp;&amp; npm run build) assurant un déploiement 100% réussi.</w:t>
+      </w:r>
+    </w:p>
+    <w:p>
       <w:pPr>
         <w:spacing w:before="480" w:after="280"/>
         <w:jc w:val="center"/>
@@ -5922,6 +6174,52 @@
     </w:p>
     <w:p>
       <w:pPr>
+        <w:pStyle w:val="Heading2"/>
+      </w:pPr>
+      <w:r>
+        <w:t>6.10 Guide 10 – Utilisation de l'Assistant IA GMAO Intelligent &amp; Agent Conversationnel</w:t>
+      </w:r>
+    </w:p>
+    <w:p>
+      <w:pPr/>
+      <w:r>
+        <w:t>L'Assistant IA GMAO permet aux techniciens et responsables de consulter l'état du Fab Lab et d'exécuter des actions de maintenance en langage naturel.</w:t>
+      </w:r>
+    </w:p>
+    <w:p>
+      <w:pPr>
+        <w:pStyle w:val="ListBullet"/>
+      </w:pPr>
+      <w:r>
+        <w:t>Étape 1 – Consultation en langage naturel : Saisissez votre question dans la boîte de dialogue de l'Assistant (ex: 'Donne-moi les informations de FL-009' ou 'chno l7ala dyal FL-009').</w:t>
+      </w:r>
+    </w:p>
+    <w:p>
+      <w:pPr>
+        <w:pStyle w:val="ListBullet"/>
+      </w:pPr>
+      <w:r>
+        <w:t>Étape 2 – Analyses croisées multi-outils : Demandez une synthèse complète (ex: 'Analyse FL-009 : donne-moi son statut, ses dernières interventions et sa prochaine maintenance préventive'). L'agent exécute automatiquement plusieurs outils métier en parallèle.</w:t>
+      </w:r>
+    </w:p>
+    <w:p>
+      <w:pPr>
+        <w:pStyle w:val="ListBullet"/>
+      </w:pPr>
+      <w:r>
+        <w:t>Étape 3 – Demande de modification et aperçu : Demandez la création d'une intervention ou une déclaration de panne. L'Assistant prépare la fiche de travail et affiche une carte de confirmation en attente.</w:t>
+      </w:r>
+    </w:p>
+    <w:p>
+      <w:pPr>
+        <w:pStyle w:val="ListBullet"/>
+      </w:pPr>
+      <w:r>
+        <w:t>Étape 4 – Validation et exécution : Cliquez sur 'Confirmer' pour enregistrer la modification en base de données et mettre à jour l'interface en temps réel, ou sur 'Annuler' pour rejeter la proposition.</w:t>
+      </w:r>
+    </w:p>
+    <w:p>
+      <w:pPr>
         <w:spacing w:before="480" w:after="280"/>
         <w:jc w:val="center"/>
         <w:pBdr>
@@ -6066,6 +6364,22 @@
           <w:sz w:val="36"/>
         </w:rPr>
         <w:t>CONCLUSION GÉNÉRALE</w:t>
+      </w:r>
+    </w:p>
+    <w:p>
+      <w:pPr>
+        <w:pStyle w:val="ListBullet"/>
+      </w:pPr>
+      <w:r>
+        <w:t>Intégration de la reconnaissance vocale directe via l'API OpenAI Whisper pour la saisie automatique des rapports d'intervention sur le terrain.</w:t>
+      </w:r>
+    </w:p>
+    <w:p>
+      <w:pPr>
+        <w:pStyle w:val="ListBullet"/>
+      </w:pPr>
+      <w:r>
+        <w:t>Mise en place d'algorithmes de maintenance prédictive croisant les données AMDEC (NPR) et l'historique des temps de fonctionnement des machines CNC.</w:t>
       </w:r>
     </w:p>
     <w:p>

</xml_diff>